<commit_message>
Reduce Lloyds runbook to essential operating steps
</commit_message>
<xml_diff>
--- a/docs/generated/Lloyds-Supplementary-Jan-2026.docx
+++ b/docs/generated/Lloyds-Supplementary-Jan-2026.docx
@@ -18,22 +18,61 @@
         <w:t xml:space="preserve">January 2026</w:t>
       </w:r>
     </w:p>
-    <w:bookmarkStart w:id="15" w:name="Xb513895b909de9f929f378d9679964331dca85f"/>
+    <w:bookmarkStart w:id="14" w:name="lloyds-runbook-lloyd-s-quick-steps"/>
     <w:p>
       <w:pPr>
         <w:pStyle w:val="Heading1"/>
       </w:pPr>
       <w:r>
-        <w:t xml:space="preserve">Lloyd’s supplementary — SQL and Excel</w:t>
-      </w:r>
-    </w:p>
-    <w:bookmarkStart w:id="9" w:name="lloyds-runbook-start-here"/>
+        <w:t xml:space="preserve">Lloyd’s — quick steps</w:t>
+      </w:r>
+    </w:p>
+    <w:p>
+      <w:pPr>
+        <w:pStyle w:val="FirstParagraph"/>
+      </w:pPr>
+      <w:r>
+        <w:t xml:space="preserve">Use working copies from</w:t>
+      </w:r>
+      <w:r>
+        <w:t xml:space="preserve"> </w:t>
+      </w:r>
+      <w:r>
+        <w:rPr>
+          <w:rStyle w:val="VerbatimChar"/>
+        </w:rPr>
+        <w:t xml:space="preserve">lloyds/workbooks/</w:t>
+      </w:r>
+      <w:r>
+        <w:t xml:space="preserve">; match the filename endings below.</w:t>
+      </w:r>
+      <w:r>
+        <w:t xml:space="preserve"> </w:t>
+      </w:r>
+      <w:r>
+        <w:t xml:space="preserve">Clear old input rows first, paste</w:t>
+      </w:r>
+      <w:r>
+        <w:t xml:space="preserve"> </w:t>
+      </w:r>
+      <w:r>
+        <w:rPr>
+          <w:b/>
+          <w:bCs/>
+        </w:rPr>
+        <w:t xml:space="preserve">without headers from row 2</w:t>
+      </w:r>
+      <w:r>
+        <w:t xml:space="preserve">, and keep formulas and scale factors intact.</w:t>
+      </w:r>
+    </w:p>
+    <w:bookmarkStart w:id="9" w:name="lloyds-runbook-south-africa"/>
     <w:p>
       <w:pPr>
         <w:pStyle w:val="Heading2"/>
       </w:pPr>
       <w:r>
-        <w:t xml:space="preserve">Start here</w:t>
+        <w:t xml:space="preserve">South Africa</w:t>
       </w:r>
     </w:p>
     <w:p>
@@ -45,7 +84,7 @@
         </w:numPr>
       </w:pPr>
       <w:r>
-        <w:t xml:space="preserve">Open working copies of the required calculation workbooks in</w:t>
+        <w:t xml:space="preserve">Run</w:t>
       </w:r>
       <w:r>
         <w:t xml:space="preserve"> </w:t>
@@ -54,10 +93,13 @@
         <w:rPr>
           <w:rStyle w:val="VerbatimChar"/>
         </w:rPr>
-        <w:t xml:space="preserve">lloyds/workbooks/</w:t>
-      </w:r>
-      <w:r>
-        <w:t xml:space="preserve">.</w:t>
+        <w:t xml:space="preserve">lloyds/sql/SouthAfrica_Aggs.sql</w:t>
+      </w:r>
+      <w:r>
+        <w:t xml:space="preserve"> </w:t>
+      </w:r>
+      <w:r>
+        <w:t xml:space="preserve">and export the results.</w:t>
       </w:r>
     </w:p>
     <w:p>
@@ -69,7 +111,7 @@
         </w:numPr>
       </w:pPr>
       <w:r>
-        <w:t xml:space="preserve">Keep</w:t>
+        <w:t xml:space="preserve">In the workbook ending</w:t>
       </w:r>
       <w:r>
         <w:t xml:space="preserve"> </w:t>
@@ -78,13 +120,10 @@
         <w:rPr>
           <w:rStyle w:val="VerbatimChar"/>
         </w:rPr>
-        <w:t xml:space="preserve">lloyds/source/Supplementary Info UKEU S33.xlsx</w:t>
-      </w:r>
-      <w:r>
-        <w:t xml:space="preserve"> </w:t>
-      </w:r>
-      <w:r>
-        <w:t xml:space="preserve">and its accompanying</w:t>
+        <w:t xml:space="preserve">South Africa EQ - Jan 2026.xlsx</w:t>
+      </w:r>
+      <w:r>
+        <w:t xml:space="preserve">, paste into</w:t>
       </w:r>
       <w:r>
         <w:t xml:space="preserve"> </w:t>
@@ -93,13 +132,13 @@
         <w:rPr>
           <w:rStyle w:val="VerbatimChar"/>
         </w:rPr>
-        <w:t xml:space="preserve">.msg</w:t>
-      </w:r>
-      <w:r>
-        <w:t xml:space="preserve"> </w:t>
-      </w:r>
-      <w:r>
-        <w:t xml:space="preserve">correspondence as source evidence, not ready-to-paste extracts.</w:t>
+        <w:t xml:space="preserve">Core data!A2</w:t>
+      </w:r>
+      <w:r>
+        <w:t xml:space="preserve"> </w:t>
+      </w:r>
+      <w:r>
+        <w:t xml:space="preserve">(A:R), preserve S and fill the correct T:U formulas down.</w:t>
       </w:r>
     </w:p>
     <w:p>
@@ -111,59 +150,32 @@
         </w:numPr>
       </w:pPr>
       <w:r>
-        <w:t xml:space="preserve">Obtain the matching extract for each branch below and check its headers against the workbook before loading it.</w:t>
-      </w:r>
-    </w:p>
-    <w:p>
-      <w:pPr>
-        <w:pStyle w:val="Compact"/>
-        <w:numPr>
-          <w:ilvl w:val="0"/>
-          <w:numId w:val="1001"/>
-        </w:numPr>
-      </w:pPr>
-      <w:r>
-        <w:t xml:space="preserve">Clear old input rows only and paste</w:t>
-      </w:r>
-      <w:r>
-        <w:t xml:space="preserve"> </w:t>
-      </w:r>
-      <w:r>
-        <w:rPr>
-          <w:b/>
-          <w:bCs/>
-        </w:rPr>
-        <w:t xml:space="preserve">data without headers from row 2</w:t>
-      </w:r>
-      <w:r>
-        <w:t xml:space="preserve">, preserving the existing headers, scale factors, formulas and report areas.</w:t>
+        <w:t xml:space="preserve">Refresh</w:t>
+      </w:r>
+      <w:r>
+        <w:t xml:space="preserve"> </w:t>
+      </w:r>
+      <w:r>
+        <w:rPr>
+          <w:rStyle w:val="VerbatimChar"/>
+        </w:rPr>
+        <w:t xml:space="preserve">05 South Africa EQ Aggs</w:t>
+      </w:r>
+      <w:r>
+        <w:t xml:space="preserve"> </w:t>
+      </w:r>
+      <w:r>
+        <w:t xml:space="preserve">and check its totals against the export.</w:t>
       </w:r>
     </w:p>
     <w:bookmarkEnd w:id="9"/>
-    <w:bookmarkStart w:id="10" w:name="X9c17fb5bf54c353e7a15deaea1177faaf3b80c3"/>
+    <w:bookmarkStart w:id="10" w:name="lloyds-runbook-california"/>
     <w:p>
       <w:pPr>
         <w:pStyle w:val="Heading2"/>
       </w:pPr>
       <w:r>
-        <w:t xml:space="preserve">Rest of World — country and peril</w:t>
-      </w:r>
-    </w:p>
-    <w:p>
-      <w:pPr>
-        <w:pStyle w:val="FirstParagraph"/>
-      </w:pPr>
-      <w:r>
-        <w:t xml:space="preserve">Workbook:</w:t>
-      </w:r>
-      <w:r>
-        <w:t xml:space="preserve"> </w:t>
-      </w:r>
-      <w:r>
-        <w:rPr>
-          <w:rStyle w:val="VerbatimChar"/>
-        </w:rPr>
-        <w:t xml:space="preserve">UKEU - Supplementary Info - RDL - Jan26 - Workings - ROW.xlsx</w:t>
+        <w:t xml:space="preserve">California</w:t>
       </w:r>
     </w:p>
     <w:p>
@@ -175,7 +187,7 @@
         </w:numPr>
       </w:pPr>
       <w:r>
-        <w:t xml:space="preserve">Obtain separate EQ, FR, FL and WS extracts using the S33 Weather evidence and confirmed transformations; the checked-in</w:t>
+        <w:t xml:space="preserve">Confirm the wildfire proxy/PML, then run</w:t>
       </w:r>
       <w:r>
         <w:t xml:space="preserve"> </w:t>
@@ -184,25 +196,13 @@
         <w:rPr>
           <w:rStyle w:val="VerbatimChar"/>
         </w:rPr>
-        <w:t xml:space="preserve">lloyds/sql/Supplementary Info - Workings - ROW Aggs - SQL.sql</w:t>
-      </w:r>
-      <w:r>
-        <w:t xml:space="preserve"> </w:t>
-      </w:r>
-      <w:r>
-        <w:t xml:space="preserve">is fixed to</w:t>
-      </w:r>
-      <w:r>
-        <w:t xml:space="preserve"> </w:t>
-      </w:r>
-      <w:r>
-        <w:rPr>
-          <w:rStyle w:val="VerbatimChar"/>
-        </w:rPr>
-        <w:t xml:space="preserve">3/3</w:t>
-      </w:r>
-      <w:r>
-        <w:t xml:space="preserve">, not all four perils.</w:t>
+        <w:t xml:space="preserve">lloyds/sql/FA_California_Aggs.sql</w:t>
+      </w:r>
+      <w:r>
+        <w:t xml:space="preserve"> </w:t>
+      </w:r>
+      <w:r>
+        <w:t xml:space="preserve">and export the results.</w:t>
       </w:r>
     </w:p>
     <w:p>
@@ -214,7 +214,7 @@
         </w:numPr>
       </w:pPr>
       <w:r>
-        <w:t xml:space="preserve">Paste A:K from row 2 into</w:t>
+        <w:t xml:space="preserve">In the workbook ending</w:t>
       </w:r>
       <w:r>
         <w:t xml:space="preserve"> </w:t>
@@ -223,10 +223,10 @@
         <w:rPr>
           <w:rStyle w:val="VerbatimChar"/>
         </w:rPr>
-        <w:t xml:space="preserve">EQ Extract - Open Market</w:t>
-      </w:r>
-      <w:r>
-        <w:t xml:space="preserve">,</w:t>
+        <w:t xml:space="preserve">California WF.xlsx</w:t>
+      </w:r>
+      <w:r>
+        <w:t xml:space="preserve">, paste into</w:t>
       </w:r>
       <w:r>
         <w:t xml:space="preserve"> </w:t>
@@ -235,37 +235,13 @@
         <w:rPr>
           <w:rStyle w:val="VerbatimChar"/>
         </w:rPr>
-        <w:t xml:space="preserve">FR Extract  - Open Market</w:t>
-      </w:r>
-      <w:r>
-        <w:t xml:space="preserve">,</w:t>
-      </w:r>
-      <w:r>
-        <w:t xml:space="preserve"> </w:t>
-      </w:r>
-      <w:r>
-        <w:rPr>
-          <w:rStyle w:val="VerbatimChar"/>
-        </w:rPr>
-        <w:t xml:space="preserve">FL Extract - Open Market</w:t>
-      </w:r>
-      <w:r>
-        <w:t xml:space="preserve"> </w:t>
-      </w:r>
-      <w:r>
-        <w:t xml:space="preserve">and</w:t>
-      </w:r>
-      <w:r>
-        <w:t xml:space="preserve"> </w:t>
-      </w:r>
-      <w:r>
-        <w:rPr>
-          <w:rStyle w:val="VerbatimChar"/>
-        </w:rPr>
-        <w:t xml:space="preserve">WS Extract - Open Market</w:t>
-      </w:r>
-      <w:r>
-        <w:t xml:space="preserve">, respectively (FR has two spaces before the hyphen).</w:t>
+        <w:t xml:space="preserve">Core data!A2</w:t>
+      </w:r>
+      <w:r>
+        <w:t xml:space="preserve"> </w:t>
+      </w:r>
+      <w:r>
+        <w:t xml:space="preserve">(A:M), preserving N.</w:t>
       </w:r>
     </w:p>
     <w:p>
@@ -277,7 +253,7 @@
         </w:numPr>
       </w:pPr>
       <w:r>
-        <w:t xml:space="preserve">Preserve scale column L, extend the correct formulas in M and remove stale input/helper rows, including the flood sheet’s old</w:t>
+        <w:t xml:space="preserve">Check the report date and totals on</w:t>
       </w:r>
       <w:r>
         <w:t xml:space="preserve"> </w:t>
@@ -286,64 +262,20 @@
         <w:rPr>
           <w:rStyle w:val="VerbatimChar"/>
         </w:rPr>
-        <w:t xml:space="preserve">#N/A</w:t>
-      </w:r>
-      <w:r>
-        <w:t xml:space="preserve"> </w:t>
-      </w:r>
-      <w:r>
-        <w:t xml:space="preserve">rows.</w:t>
-      </w:r>
-    </w:p>
-    <w:p>
-      <w:pPr>
-        <w:pStyle w:val="Compact"/>
-        <w:numPr>
-          <w:ilvl w:val="0"/>
-          <w:numId w:val="1002"/>
-        </w:numPr>
-      </w:pPr>
-      <w:r>
-        <w:t xml:space="preserve">Confirm the measure, currency, scales and pivot ranges before refreshing the report</w:t>
-      </w:r>
-      <w:r>
-        <w:t xml:space="preserve"> </w:t>
-      </w:r>
-      <w:r>
-        <w:rPr>
-          <w:rStyle w:val="VerbatimChar"/>
-        </w:rPr>
-        <w:t xml:space="preserve">3. RoW Exposure Monitoring</w:t>
+        <w:t xml:space="preserve">06 California Wildfire Aggs</w:t>
       </w:r>
       <w:r>
         <w:t xml:space="preserve">.</w:t>
       </w:r>
     </w:p>
     <w:bookmarkEnd w:id="10"/>
-    <w:bookmarkStart w:id="11" w:name="Xb0884f1a3af61518e594a8cd38f95a2b604cae6"/>
+    <w:bookmarkStart w:id="11" w:name="lloyds-runbook-rest-of-world"/>
     <w:p>
       <w:pPr>
         <w:pStyle w:val="Heading2"/>
       </w:pPr>
       <w:r>
-        <w:t xml:space="preserve">South Africa — earthquake CRESTA</w:t>
-      </w:r>
-    </w:p>
-    <w:p>
-      <w:pPr>
-        <w:pStyle w:val="FirstParagraph"/>
-      </w:pPr>
-      <w:r>
-        <w:t xml:space="preserve">Workbook:</w:t>
-      </w:r>
-      <w:r>
-        <w:t xml:space="preserve"> </w:t>
-      </w:r>
-      <w:r>
-        <w:rPr>
-          <w:rStyle w:val="VerbatimChar"/>
-        </w:rPr>
-        <w:t xml:space="preserve">UKEU - Supplementary Info - Workings - South Africa EQ - Jan 2026.xlsx</w:t>
+        <w:t xml:space="preserve">Rest of World</w:t>
       </w:r>
     </w:p>
     <w:p>
@@ -355,7 +287,7 @@
         </w:numPr>
       </w:pPr>
       <w:r>
-        <w:t xml:space="preserve">Run the confirmed</w:t>
+        <w:t xml:space="preserve">Obtain separate EQ, FR, FL and WS extracts; the existing ROW SQL is fixed to</w:t>
       </w:r>
       <w:r>
         <w:t xml:space="preserve"> </w:t>
@@ -364,13 +296,10 @@
         <w:rPr>
           <w:rStyle w:val="VerbatimChar"/>
         </w:rPr>
-        <w:t xml:space="preserve">lloyds/sql/SouthAfrica_Aggs.sql</w:t>
-      </w:r>
-      <w:r>
-        <w:t xml:space="preserve"> </w:t>
-      </w:r>
-      <w:r>
-        <w:t xml:space="preserve">extraction or matching transformation; the S33 Quake tab alone lacks the required CRESTA fields.</w:t>
+        <w:t xml:space="preserve">3/3</w:t>
+      </w:r>
+      <w:r>
+        <w:t xml:space="preserve">, not all four perils.</w:t>
       </w:r>
     </w:p>
     <w:p>
@@ -382,7 +311,7 @@
         </w:numPr>
       </w:pPr>
       <w:r>
-        <w:t xml:space="preserve">Paste into</w:t>
+        <w:t xml:space="preserve">In the workbook ending</w:t>
       </w:r>
       <w:r>
         <w:t xml:space="preserve"> </w:t>
@@ -391,10 +320,64 @@
         <w:rPr>
           <w:rStyle w:val="VerbatimChar"/>
         </w:rPr>
-        <w:t xml:space="preserve">Core data!A2</w:t>
-      </w:r>
-      <w:r>
-        <w:t xml:space="preserve">, filling A:R only, preserve scale column S and extend the correct formulas in T:U.</w:t>
+        <w:t xml:space="preserve">ROW.xlsx</w:t>
+      </w:r>
+      <w:r>
+        <w:t xml:space="preserve">, paste A:K into the matching</w:t>
+      </w:r>
+      <w:r>
+        <w:t xml:space="preserve"> </w:t>
+      </w:r>
+      <w:r>
+        <w:rPr>
+          <w:rStyle w:val="VerbatimChar"/>
+        </w:rPr>
+        <w:t xml:space="preserve">EQ</w:t>
+      </w:r>
+      <w:r>
+        <w:t xml:space="preserve">,</w:t>
+      </w:r>
+      <w:r>
+        <w:t xml:space="preserve"> </w:t>
+      </w:r>
+      <w:r>
+        <w:rPr>
+          <w:rStyle w:val="VerbatimChar"/>
+        </w:rPr>
+        <w:t xml:space="preserve">FR</w:t>
+      </w:r>
+      <w:r>
+        <w:t xml:space="preserve">,</w:t>
+      </w:r>
+      <w:r>
+        <w:t xml:space="preserve"> </w:t>
+      </w:r>
+      <w:r>
+        <w:rPr>
+          <w:rStyle w:val="VerbatimChar"/>
+        </w:rPr>
+        <w:t xml:space="preserve">FL</w:t>
+      </w:r>
+      <w:r>
+        <w:t xml:space="preserve"> </w:t>
+      </w:r>
+      <w:r>
+        <w:t xml:space="preserve">and</w:t>
+      </w:r>
+      <w:r>
+        <w:t xml:space="preserve"> </w:t>
+      </w:r>
+      <w:r>
+        <w:rPr>
+          <w:rStyle w:val="VerbatimChar"/>
+        </w:rPr>
+        <w:t xml:space="preserve">WS Extract - Open Market</w:t>
+      </w:r>
+      <w:r>
+        <w:t xml:space="preserve"> </w:t>
+      </w:r>
+      <w:r>
+        <w:t xml:space="preserve">sheets from A2, preserve L and fill the correct M formulas down.</w:t>
       </w:r>
     </w:p>
     <w:p>
@@ -406,7 +389,7 @@
         </w:numPr>
       </w:pPr>
       <w:r>
-        <w:t xml:space="preserve">Confirm gross/net treatment, currency, report date, source ranges and blank/unmapped CRESTA treatment before refreshing</w:t>
+        <w:t xml:space="preserve">Update the pivot ranges, refresh</w:t>
       </w:r>
       <w:r>
         <w:t xml:space="preserve"> </w:t>
@@ -415,37 +398,23 @@
         <w:rPr>
           <w:rStyle w:val="VerbatimChar"/>
         </w:rPr>
-        <w:t xml:space="preserve">05 South Africa EQ Aggs</w:t>
-      </w:r>
-      <w:r>
-        <w:t xml:space="preserve">.</w:t>
+        <w:t xml:space="preserve">3. RoW Exposure Monitoring</w:t>
+      </w:r>
+      <w:r>
+        <w:t xml:space="preserve"> </w:t>
+      </w:r>
+      <w:r>
+        <w:t xml:space="preserve">and check totals.</w:t>
       </w:r>
     </w:p>
     <w:bookmarkEnd w:id="11"/>
-    <w:bookmarkStart w:id="12" w:name="Xea29828069445c7d8db0899008043c0419f74a2"/>
+    <w:bookmarkStart w:id="12" w:name="lloyds-runbook-europe"/>
     <w:p>
       <w:pPr>
         <w:pStyle w:val="Heading2"/>
       </w:pPr>
       <w:r>
-        <w:t xml:space="preserve">California — wildfire county</w:t>
-      </w:r>
-    </w:p>
-    <w:p>
-      <w:pPr>
-        <w:pStyle w:val="FirstParagraph"/>
-      </w:pPr>
-      <w:r>
-        <w:t xml:space="preserve">Workbook:</w:t>
-      </w:r>
-      <w:r>
-        <w:t xml:space="preserve"> </w:t>
-      </w:r>
-      <w:r>
-        <w:rPr>
-          <w:rStyle w:val="VerbatimChar"/>
-        </w:rPr>
-        <w:t xml:space="preserve">UKEU - Supplementary Info - RDL - Jan26 - Workings - California WF.xlsx</w:t>
+        <w:t xml:space="preserve">Europe</w:t>
       </w:r>
     </w:p>
     <w:p>
@@ -457,19 +426,7 @@
         </w:numPr>
       </w:pPr>
       <w:r>
-        <w:t xml:space="preserve">Confirm the wildfire exposure/proxy and PML before using</w:t>
-      </w:r>
-      <w:r>
-        <w:t xml:space="preserve"> </w:t>
-      </w:r>
-      <w:r>
-        <w:rPr>
-          <w:rStyle w:val="VerbatimChar"/>
-        </w:rPr>
-        <w:t xml:space="preserve">lloyds/sql/FA_California_Aggs.sql</w:t>
-      </w:r>
-      <w:r>
-        <w:t xml:space="preserve">; do not invent county data from S33.</w:t>
+        <w:t xml:space="preserve">Obtain separate earthquake and flood extracts; no matching producer is supplied yet.</w:t>
       </w:r>
     </w:p>
     <w:p>
@@ -481,7 +438,7 @@
         </w:numPr>
       </w:pPr>
       <w:r>
-        <w:t xml:space="preserve">Paste into</w:t>
+        <w:t xml:space="preserve">In the workbook ending</w:t>
       </w:r>
       <w:r>
         <w:t xml:space="preserve"> </w:t>
@@ -490,10 +447,37 @@
         <w:rPr>
           <w:rStyle w:val="VerbatimChar"/>
         </w:rPr>
-        <w:t xml:space="preserve">Core data!A2</w:t>
-      </w:r>
-      <w:r>
-        <w:t xml:space="preserve">, filling A:M only, and preserve helper column N.</w:t>
+        <w:t xml:space="preserve">EU Cresta.xlsx</w:t>
+      </w:r>
+      <w:r>
+        <w:t xml:space="preserve">, paste A:R into</w:t>
+      </w:r>
+      <w:r>
+        <w:t xml:space="preserve"> </w:t>
+      </w:r>
+      <w:r>
+        <w:rPr>
+          <w:rStyle w:val="VerbatimChar"/>
+        </w:rPr>
+        <w:t xml:space="preserve">Core data EQ!A2</w:t>
+      </w:r>
+      <w:r>
+        <w:t xml:space="preserve"> </w:t>
+      </w:r>
+      <w:r>
+        <w:t xml:space="preserve">and</w:t>
+      </w:r>
+      <w:r>
+        <w:t xml:space="preserve"> </w:t>
+      </w:r>
+      <w:r>
+        <w:rPr>
+          <w:rStyle w:val="VerbatimChar"/>
+        </w:rPr>
+        <w:t xml:space="preserve">Core data FL!A2</w:t>
+      </w:r>
+      <w:r>
+        <w:t xml:space="preserve">, preserving S:U.</w:t>
       </w:r>
     </w:p>
     <w:p>
@@ -505,7 +489,7 @@
         </w:numPr>
       </w:pPr>
       <w:r>
-        <w:t xml:space="preserve">Resolve the report-date mismatch before reviewing</w:t>
+        <w:t xml:space="preserve">Correct the mixed source/USD flood formulas before filling down or refreshing</w:t>
       </w:r>
       <w:r>
         <w:t xml:space="preserve"> </w:t>
@@ -514,37 +498,20 @@
         <w:rPr>
           <w:rStyle w:val="VerbatimChar"/>
         </w:rPr>
-        <w:t xml:space="preserve">06 California Wildfire Aggs</w:t>
+        <w:t xml:space="preserve">11 LIC EU CRESTA</w:t>
       </w:r>
       <w:r>
         <w:t xml:space="preserve">.</w:t>
       </w:r>
     </w:p>
     <w:bookmarkEnd w:id="12"/>
-    <w:bookmarkStart w:id="13" w:name="Xa540dbe1a82d482423091d7a60609186a41fb86"/>
+    <w:bookmarkStart w:id="13" w:name="lloyds-runbook-finish"/>
     <w:p>
       <w:pPr>
         <w:pStyle w:val="Heading2"/>
       </w:pPr>
       <w:r>
-        <w:t xml:space="preserve">Europe — earthquake and flood CRESTA</w:t>
-      </w:r>
-    </w:p>
-    <w:p>
-      <w:pPr>
-        <w:pStyle w:val="FirstParagraph"/>
-      </w:pPr>
-      <w:r>
-        <w:t xml:space="preserve">Workbook:</w:t>
-      </w:r>
-      <w:r>
-        <w:t xml:space="preserve"> </w:t>
-      </w:r>
-      <w:r>
-        <w:rPr>
-          <w:rStyle w:val="VerbatimChar"/>
-        </w:rPr>
-        <w:t xml:space="preserve">UKEU - Supplementary Info - RDL - Jan26 - Workings - EU Cresta.xlsx</w:t>
+        <w:t xml:space="preserve">Finish</w:t>
       </w:r>
     </w:p>
     <w:p>
@@ -556,22 +523,7 @@
         </w:numPr>
       </w:pPr>
       <w:r>
-        <w:t xml:space="preserve">Obtain separately confirmed EQ and FL extracts; the S33</w:t>
-      </w:r>
-      <w:r>
-        <w:t xml:space="preserve"> </w:t>
-      </w:r>
-      <w:r>
-        <w:rPr>
-          <w:rStyle w:val="VerbatimChar"/>
-        </w:rPr>
-        <w:t xml:space="preserve">EU exposure - weather &amp; quake</w:t>
-      </w:r>
-      <w:r>
-        <w:t xml:space="preserve"> </w:t>
-      </w:r>
-      <w:r>
-        <w:t xml:space="preserve">tab needs a transformation and no matching producer is checked in.</w:t>
+        <w:t xml:space="preserve">Check currency, units, scales, dates, missing geography and formula errors; do not blindly refresh external links.</w:t>
       </w:r>
     </w:p>
     <w:p>
@@ -583,104 +535,7 @@
         </w:numPr>
       </w:pPr>
       <w:r>
-        <w:t xml:space="preserve">Paste into</w:t>
-      </w:r>
-      <w:r>
-        <w:t xml:space="preserve"> </w:t>
-      </w:r>
-      <w:r>
-        <w:rPr>
-          <w:rStyle w:val="VerbatimChar"/>
-        </w:rPr>
-        <w:t xml:space="preserve">Core data EQ!A2</w:t>
-      </w:r>
-      <w:r>
-        <w:t xml:space="preserve"> </w:t>
-      </w:r>
-      <w:r>
-        <w:t xml:space="preserve">and</w:t>
-      </w:r>
-      <w:r>
-        <w:t xml:space="preserve"> </w:t>
-      </w:r>
-      <w:r>
-        <w:rPr>
-          <w:rStyle w:val="VerbatimChar"/>
-        </w:rPr>
-        <w:t xml:space="preserve">Core data FL!A2</w:t>
-      </w:r>
-      <w:r>
-        <w:t xml:space="preserve">, filling A:R only and preserving scale S and formulas T:U.</w:t>
-      </w:r>
-    </w:p>
-    <w:p>
-      <w:pPr>
-        <w:pStyle w:val="Compact"/>
-        <w:numPr>
-          <w:ilvl w:val="0"/>
-          <w:numId w:val="1005"/>
-        </w:numPr>
-      </w:pPr>
-      <w:r>
-        <w:t xml:space="preserve">Resolve the mixed source/USD flood formulas before filling down, and confirm FX direction/date and unmapped-zone treatment before reviewing</w:t>
-      </w:r>
-      <w:r>
-        <w:t xml:space="preserve"> </w:t>
-      </w:r>
-      <w:r>
-        <w:rPr>
-          <w:rStyle w:val="VerbatimChar"/>
-        </w:rPr>
-        <w:t xml:space="preserve">11 LIC EU CRESTA</w:t>
-      </w:r>
-      <w:r>
-        <w:t xml:space="preserve">.</w:t>
-      </w:r>
-    </w:p>
-    <w:bookmarkEnd w:id="13"/>
-    <w:bookmarkStart w:id="14" w:name="lloyds-runbook-finish-each-branch"/>
-    <w:p>
-      <w:pPr>
-        <w:pStyle w:val="Heading2"/>
-      </w:pPr>
-      <w:r>
-        <w:t xml:space="preserve">Finish each branch</w:t>
-      </w:r>
-    </w:p>
-    <w:p>
-      <w:pPr>
-        <w:pStyle w:val="Compact"/>
-        <w:numPr>
-          <w:ilvl w:val="0"/>
-          <w:numId w:val="1006"/>
-        </w:numPr>
-      </w:pPr>
-      <w:r>
-        <w:t xml:space="preserve">Extend only confirmed formulas and source ranges through the new data, refresh the relevant pivots and recalculate in Excel without blindly updating external links.</w:t>
-      </w:r>
-    </w:p>
-    <w:p>
-      <w:pPr>
-        <w:pStyle w:val="Compact"/>
-        <w:numPr>
-          <w:ilvl w:val="0"/>
-          <w:numId w:val="1006"/>
-        </w:numPr>
-      </w:pPr>
-      <w:r>
-        <w:t xml:space="preserve">Reconcile report totals and agreed exclusions to the extract and resolve formula errors, missing geography and unexplained differences.</w:t>
-      </w:r>
-    </w:p>
-    <w:p>
-      <w:pPr>
-        <w:pStyle w:val="Compact"/>
-        <w:numPr>
-          <w:ilvl w:val="0"/>
-          <w:numId w:val="1006"/>
-        </w:numPr>
-      </w:pPr>
-      <w:r>
-        <w:t xml:space="preserve">Save the workbook, extract and reconciliation together; transfer values only when the final template and destination cells have been agreed.</w:t>
+        <w:t xml:space="preserve">Reconcile each report and agreed exclusions to its extract, then save the workbook and CSV together.</w:t>
       </w:r>
     </w:p>
     <w:p>
@@ -692,17 +547,17 @@
           <w:b/>
           <w:bCs/>
         </w:rPr>
-        <w:t xml:space="preserve">To return to later:</w:t>
-      </w:r>
-      <w:r>
-        <w:t xml:space="preserve"> </w:t>
-      </w:r>
-      <w:r>
-        <w:t xml:space="preserve">obtain the final Lloyd’s/RDS template and agreed destination cells; these are calculation reports, not completed submission forms.</w:t>
-      </w:r>
-    </w:p>
+        <w:t xml:space="preserve">Still needed:</w:t>
+      </w:r>
+      <w:r>
+        <w:t xml:space="preserve"> </w:t>
+      </w:r>
+      <w:r>
+        <w:t xml:space="preserve">the final Lloyd’s submission template and destination cells.</w:t>
+      </w:r>
+    </w:p>
+    <w:bookmarkEnd w:id="13"/>
     <w:bookmarkEnd w:id="14"/>
-    <w:bookmarkEnd w:id="15"/>
     <w:sectPr>
       <w:footnotePr>
         <w:numRestart w:val="eachSect"/>
@@ -1022,36 +877,6 @@
     </w:lvlOverride>
   </w:num>
   <w:num w:numId="1005">
-    <w:abstractNumId w:val="99411"/>
-    <w:lvlOverride w:ilvl="0">
-      <w:startOverride w:val="1"/>
-    </w:lvlOverride>
-    <w:lvlOverride w:ilvl="1">
-      <w:startOverride w:val="1"/>
-    </w:lvlOverride>
-    <w:lvlOverride w:ilvl="2">
-      <w:startOverride w:val="1"/>
-    </w:lvlOverride>
-    <w:lvlOverride w:ilvl="3">
-      <w:startOverride w:val="1"/>
-    </w:lvlOverride>
-    <w:lvlOverride w:ilvl="4">
-      <w:startOverride w:val="1"/>
-    </w:lvlOverride>
-    <w:lvlOverride w:ilvl="5">
-      <w:startOverride w:val="1"/>
-    </w:lvlOverride>
-    <w:lvlOverride w:ilvl="6">
-      <w:startOverride w:val="1"/>
-    </w:lvlOverride>
-    <w:lvlOverride w:ilvl="7">
-      <w:startOverride w:val="1"/>
-    </w:lvlOverride>
-    <w:lvlOverride w:ilvl="8">
-      <w:startOverride w:val="1"/>
-    </w:lvlOverride>
-  </w:num>
-  <w:num w:numId="1006">
     <w:abstractNumId w:val="99411"/>
     <w:lvlOverride w:ilvl="0">
       <w:startOverride w:val="1"/>

</xml_diff>